<commit_message>
Update Account & DiarioMatteo-29.05.docx
</commit_message>
<xml_diff>
--- a/1_Documentazione/DiarioMatteo-29.05.docx
+++ b/1_Documentazione/DiarioMatteo-29.05.docx
@@ -221,7 +221,7 @@
               <w:rPr>
                 <w:rFonts w:ascii="Arial" w:hAnsi="Arial" w:cs="Arial"/>
               </w:rPr>
-              <w:t>2</w:t>
+              <w:t>3</w:t>
             </w:r>
             <w:r>
               <w:rPr>
@@ -233,7 +233,7 @@
               <w:rPr>
                 <w:rFonts w:ascii="Arial" w:hAnsi="Arial" w:cs="Arial"/>
               </w:rPr>
-              <w:t>40</w:t>
+              <w:t>15</w:t>
             </w:r>
             <w:r>
               <w:rPr>
@@ -316,6 +316,12 @@
                 <w:rFonts w:ascii="Arial" w:hAnsi="Arial" w:cs="Arial"/>
               </w:rPr>
             </w:pPr>
+            <w:r>
+              <w:rPr>
+                <w:rFonts w:ascii="Arial" w:hAnsi="Arial" w:cs="Arial"/>
+              </w:rPr>
+              <w:t>Modifica definitiva della pagina impostazioni</w:t>
+            </w:r>
           </w:p>
         </w:tc>
       </w:tr>
@@ -604,7 +610,7 @@
           </w:rPr>
           <w:id w:val="-1715336551"/>
           <w14:checkbox>
-            <w14:checked w14:val="0"/>
+            <w14:checked w14:val="1"/>
             <w14:checkedState w14:val="2612" w14:font="MS Gothic"/>
             <w14:uncheckedState w14:val="2610" w14:font="MS Gothic"/>
           </w14:checkbox>
@@ -614,7 +620,7 @@
             <w:rPr>
               <w:rFonts w:ascii="MS Gothic" w:eastAsia="MS Gothic" w:hAnsi="MS Gothic" w:cs="Segoe UI Symbol" w:hint="eastAsia"/>
             </w:rPr>
-            <w:t>☐</w:t>
+            <w:t>☒</w:t>
           </w:r>
         </w:sdtContent>
       </w:sdt>
@@ -668,6 +674,12 @@
           <w:rFonts w:ascii="Arial" w:hAnsi="Arial" w:cs="Arial"/>
         </w:rPr>
         <w:t xml:space="preserve">: </w:t>
+      </w:r>
+      <w:r>
+        <w:rPr>
+          <w:rFonts w:ascii="Arial" w:hAnsi="Arial" w:cs="Arial"/>
+        </w:rPr>
+        <w:t>Google AI</w:t>
       </w:r>
     </w:p>
     <w:p>
@@ -703,7 +715,7 @@
           </w:rPr>
           <w:id w:val="1884593211"/>
           <w14:checkbox>
-            <w14:checked w14:val="0"/>
+            <w14:checked w14:val="1"/>
             <w14:checkedState w14:val="2612" w14:font="MS Gothic"/>
             <w14:uncheckedState w14:val="2610" w14:font="MS Gothic"/>
           </w14:checkbox>
@@ -713,7 +725,7 @@
             <w:rPr>
               <w:rFonts w:ascii="MS Gothic" w:eastAsia="MS Gothic" w:hAnsi="MS Gothic" w:cs="Segoe UI Symbol" w:hint="eastAsia"/>
             </w:rPr>
-            <w:t>☐</w:t>
+            <w:t>☒</w:t>
           </w:r>
         </w:sdtContent>
       </w:sdt>
@@ -733,7 +745,7 @@
           </w:rPr>
           <w:id w:val="-1631012876"/>
           <w14:checkbox>
-            <w14:checked w14:val="0"/>
+            <w14:checked w14:val="1"/>
             <w14:checkedState w14:val="2612" w14:font="MS Gothic"/>
             <w14:uncheckedState w14:val="2610" w14:font="MS Gothic"/>
           </w14:checkbox>
@@ -743,7 +755,7 @@
             <w:rPr>
               <w:rFonts w:ascii="MS Gothic" w:eastAsia="MS Gothic" w:hAnsi="MS Gothic" w:cs="Segoe UI Symbol" w:hint="eastAsia"/>
             </w:rPr>
-            <w:t>☐</w:t>
+            <w:t>☒</w:t>
           </w:r>
         </w:sdtContent>
       </w:sdt>
@@ -943,21 +955,6 @@
         <w:t>Spiegazione, esempio, soluzione, suggerimento…</w:t>
       </w:r>
       <w:bookmarkEnd w:id="3"/>
-    </w:p>
-    <w:p>
-      <w:pPr>
-        <w:pStyle w:val="Nessunaspaziatura"/>
-        <w:rPr>
-          <w:rFonts w:ascii="Arial" w:hAnsi="Arial" w:cs="Arial"/>
-          <w:color w:val="002060"/>
-        </w:rPr>
-      </w:pPr>
-      <w:r>
-        <w:rPr>
-          <w:rFonts w:ascii="Arial" w:hAnsi="Arial" w:cs="Arial"/>
-        </w:rPr>
-        <w:t>Possibili errori e soluzioni</w:t>
-      </w:r>
       <w:r>
         <w:rPr>
           <w:rFonts w:ascii="Arial" w:hAnsi="Arial" w:cs="Arial"/>
@@ -1034,7 +1031,7 @@
           </w:rPr>
           <w:id w:val="1841200741"/>
           <w14:checkbox>
-            <w14:checked w14:val="0"/>
+            <w14:checked w14:val="1"/>
             <w14:checkedState w14:val="2612" w14:font="MS Gothic"/>
             <w14:uncheckedState w14:val="2610" w14:font="MS Gothic"/>
           </w14:checkbox>
@@ -1044,7 +1041,7 @@
             <w:rPr>
               <w:rFonts w:ascii="MS Gothic" w:eastAsia="MS Gothic" w:hAnsi="MS Gothic" w:cs="Segoe UI Symbol" w:hint="eastAsia"/>
             </w:rPr>
-            <w:t>☐</w:t>
+            <w:t>☒</w:t>
           </w:r>
         </w:sdtContent>
       </w:sdt>
@@ -1162,6 +1159,13 @@
           <w:color w:val="0070C0"/>
         </w:rPr>
       </w:pPr>
+      <w:r>
+        <w:rPr>
+          <w:rFonts w:ascii="Arial" w:hAnsi="Arial" w:cs="Arial"/>
+          <w:color w:val="0070C0"/>
+        </w:rPr>
+        <w:t>NULLA : )</w:t>
+      </w:r>
     </w:p>
     <w:sectPr>
       <w:headerReference w:type="even" r:id="rId8"/>
@@ -2753,6 +2757,7 @@
     <w:rsid w:val="005A5AA7"/>
     <w:rsid w:val="005B3220"/>
     <w:rsid w:val="005C623B"/>
+    <w:rsid w:val="005D522F"/>
     <w:rsid w:val="005E7ECF"/>
     <w:rsid w:val="005F1B75"/>
     <w:rsid w:val="00623848"/>
@@ -2788,6 +2793,7 @@
     <w:rsid w:val="00881496"/>
     <w:rsid w:val="008A035F"/>
     <w:rsid w:val="008B2628"/>
+    <w:rsid w:val="008B3846"/>
     <w:rsid w:val="008C4F7D"/>
     <w:rsid w:val="008D35B3"/>
     <w:rsid w:val="00903606"/>

</xml_diff>